<commit_message>
Export with pdf and docx
</commit_message>
<xml_diff>
--- a/backend/template/NTT_DATA_Resume_Templates.docx
+++ b/backend/template/NTT_DATA_Resume_Templates.docx
@@ -107,7 +107,18 @@
               <w:spacing w:line="240" w:lineRule="auto"/>
             </w:pPr>
             <w:r>
-              <w:t xml:space="preserve">First/Last Name </w:t>
+              <w:t>{{</w:t>
+            </w:r>
+            <w:proofErr w:type="spellStart"/>
+            <w:r>
+              <w:t>fullName</w:t>
+            </w:r>
+            <w:proofErr w:type="spellEnd"/>
+            <w:r>
+              <w:t>}}</w:t>
+            </w:r>
+            <w:r>
+              <w:t xml:space="preserve"> </w:t>
             </w:r>
           </w:p>
           <w:p>
@@ -116,7 +127,7 @@
               <w:spacing w:line="240" w:lineRule="auto"/>
             </w:pPr>
             <w:r>
-              <w:t>Title</w:t>
+              <w:t>{{title}}</w:t>
             </w:r>
           </w:p>
           <w:p>
@@ -135,7 +146,15 @@
                 <w:sz w:val="22"/>
                 <w:szCs w:val="22"/>
               </w:rPr>
-              <w:t xml:space="preserve">Location: </w:t>
+              <w:t>{{location}}</w:t>
+            </w:r>
+            <w:r>
+              <w:rPr>
+                <w:rFonts w:ascii="Arial" w:hAnsi="Arial" w:cs="Arial"/>
+                <w:sz w:val="22"/>
+                <w:szCs w:val="22"/>
+              </w:rPr>
+              <w:t xml:space="preserve"> </w:t>
             </w:r>
           </w:p>
           <w:p>
@@ -225,265 +244,6 @@
               <w:spacing w:before="120" w:after="120" w:line="240" w:lineRule="auto"/>
               <w:rPr>
                 <w:rFonts w:ascii="Arial" w:hAnsi="Arial" w:cs="Arial"/>
-                <w:sz w:val="22"/>
-                <w:szCs w:val="22"/>
-              </w:rPr>
-            </w:pPr>
-            <w:r>
-              <w:rPr>
-                <w:rFonts w:ascii="Arial" w:hAnsi="Arial" w:cs="Arial"/>
-                <w:sz w:val="22"/>
-                <w:szCs w:val="22"/>
-              </w:rPr>
-              <w:t xml:space="preserve">&lt;Add </w:t>
-            </w:r>
-            <w:r>
-              <w:rPr>
-                <w:rFonts w:ascii="Arial" w:hAnsi="Arial" w:cs="Arial"/>
-                <w:color w:val="000000" w:themeColor="text1" w:themeShade="80"/>
-                <w:w w:val="105"/>
-                <w:sz w:val="22"/>
-                <w:szCs w:val="22"/>
-              </w:rPr>
-              <w:t>short</w:t>
-            </w:r>
-            <w:r>
-              <w:rPr>
-                <w:rFonts w:ascii="Arial" w:hAnsi="Arial" w:cs="Arial"/>
-                <w:color w:val="000000" w:themeColor="text1" w:themeShade="80"/>
-                <w:spacing w:val="-6"/>
-                <w:w w:val="105"/>
-                <w:sz w:val="22"/>
-                <w:szCs w:val="22"/>
-              </w:rPr>
-              <w:t xml:space="preserve"> </w:t>
-            </w:r>
-            <w:r>
-              <w:rPr>
-                <w:rFonts w:ascii="Arial" w:hAnsi="Arial" w:cs="Arial"/>
-                <w:color w:val="000000" w:themeColor="text1" w:themeShade="80"/>
-                <w:w w:val="105"/>
-                <w:sz w:val="22"/>
-                <w:szCs w:val="22"/>
-              </w:rPr>
-              <w:t>bullet</w:t>
-            </w:r>
-            <w:r>
-              <w:rPr>
-                <w:rFonts w:ascii="Arial" w:hAnsi="Arial" w:cs="Arial"/>
-                <w:color w:val="000000" w:themeColor="text1" w:themeShade="80"/>
-                <w:spacing w:val="-6"/>
-                <w:w w:val="105"/>
-                <w:sz w:val="22"/>
-                <w:szCs w:val="22"/>
-              </w:rPr>
-              <w:t xml:space="preserve"> </w:t>
-            </w:r>
-            <w:r>
-              <w:rPr>
-                <w:rFonts w:ascii="Arial" w:hAnsi="Arial" w:cs="Arial"/>
-                <w:color w:val="000000" w:themeColor="text1" w:themeShade="80"/>
-                <w:w w:val="105"/>
-                <w:sz w:val="22"/>
-                <w:szCs w:val="22"/>
-              </w:rPr>
-              <w:t>points</w:t>
-            </w:r>
-            <w:r>
-              <w:rPr>
-                <w:rFonts w:ascii="Arial" w:hAnsi="Arial" w:cs="Arial"/>
-                <w:color w:val="000000" w:themeColor="text1" w:themeShade="80"/>
-                <w:spacing w:val="-5"/>
-                <w:w w:val="105"/>
-                <w:sz w:val="22"/>
-                <w:szCs w:val="22"/>
-              </w:rPr>
-              <w:t xml:space="preserve"> </w:t>
-            </w:r>
-            <w:r>
-              <w:rPr>
-                <w:rFonts w:ascii="Arial" w:hAnsi="Arial" w:cs="Arial"/>
-                <w:color w:val="000000" w:themeColor="text1" w:themeShade="80"/>
-                <w:w w:val="105"/>
-                <w:sz w:val="22"/>
-                <w:szCs w:val="22"/>
-              </w:rPr>
-              <w:t>of</w:t>
-            </w:r>
-            <w:r>
-              <w:rPr>
-                <w:rFonts w:ascii="Arial" w:hAnsi="Arial" w:cs="Arial"/>
-                <w:color w:val="000000" w:themeColor="text1" w:themeShade="80"/>
-                <w:spacing w:val="-15"/>
-                <w:w w:val="105"/>
-                <w:sz w:val="22"/>
-                <w:szCs w:val="22"/>
-              </w:rPr>
-              <w:t xml:space="preserve"> </w:t>
-            </w:r>
-            <w:r>
-              <w:rPr>
-                <w:rFonts w:ascii="Arial" w:hAnsi="Arial" w:cs="Arial"/>
-                <w:color w:val="000000" w:themeColor="text1" w:themeShade="80"/>
-                <w:w w:val="105"/>
-                <w:sz w:val="22"/>
-                <w:szCs w:val="22"/>
-              </w:rPr>
-              <w:t>your</w:t>
-            </w:r>
-            <w:r>
-              <w:rPr>
-                <w:rFonts w:ascii="Arial" w:hAnsi="Arial" w:cs="Arial"/>
-                <w:color w:val="000000" w:themeColor="text1" w:themeShade="80"/>
-                <w:spacing w:val="-11"/>
-                <w:w w:val="105"/>
-                <w:sz w:val="22"/>
-                <w:szCs w:val="22"/>
-              </w:rPr>
-              <w:t xml:space="preserve"> </w:t>
-            </w:r>
-            <w:r>
-              <w:rPr>
-                <w:rFonts w:ascii="Arial" w:hAnsi="Arial" w:cs="Arial"/>
-                <w:color w:val="000000" w:themeColor="text1" w:themeShade="80"/>
-                <w:w w:val="105"/>
-                <w:sz w:val="22"/>
-                <w:szCs w:val="22"/>
-              </w:rPr>
-              <w:t>years</w:t>
-            </w:r>
-            <w:r>
-              <w:rPr>
-                <w:rFonts w:ascii="Arial" w:hAnsi="Arial" w:cs="Arial"/>
-                <w:color w:val="000000" w:themeColor="text1" w:themeShade="80"/>
-                <w:spacing w:val="-8"/>
-                <w:w w:val="105"/>
-                <w:sz w:val="22"/>
-                <w:szCs w:val="22"/>
-              </w:rPr>
-              <w:t xml:space="preserve"> </w:t>
-            </w:r>
-            <w:r>
-              <w:rPr>
-                <w:rFonts w:ascii="Arial" w:hAnsi="Arial" w:cs="Arial"/>
-                <w:color w:val="000000" w:themeColor="text1" w:themeShade="80"/>
-                <w:w w:val="105"/>
-                <w:sz w:val="22"/>
-                <w:szCs w:val="22"/>
-              </w:rPr>
-              <w:t>of</w:t>
-            </w:r>
-            <w:r>
-              <w:rPr>
-                <w:rFonts w:ascii="Arial" w:hAnsi="Arial" w:cs="Arial"/>
-                <w:color w:val="000000" w:themeColor="text1" w:themeShade="80"/>
-                <w:spacing w:val="-15"/>
-                <w:w w:val="105"/>
-                <w:sz w:val="22"/>
-                <w:szCs w:val="22"/>
-              </w:rPr>
-              <w:t xml:space="preserve"> </w:t>
-            </w:r>
-            <w:r>
-              <w:rPr>
-                <w:rFonts w:ascii="Arial" w:hAnsi="Arial" w:cs="Arial"/>
-                <w:color w:val="000000" w:themeColor="text1" w:themeShade="80"/>
-                <w:w w:val="105"/>
-                <w:sz w:val="22"/>
-                <w:szCs w:val="22"/>
-              </w:rPr>
-              <w:t>experience</w:t>
-            </w:r>
-            <w:r>
-              <w:rPr>
-                <w:rFonts w:ascii="Arial" w:hAnsi="Arial" w:cs="Arial"/>
-                <w:color w:val="000000" w:themeColor="text1" w:themeShade="80"/>
-                <w:spacing w:val="-6"/>
-                <w:w w:val="105"/>
-                <w:sz w:val="22"/>
-                <w:szCs w:val="22"/>
-              </w:rPr>
-              <w:t xml:space="preserve"> </w:t>
-            </w:r>
-            <w:r>
-              <w:rPr>
-                <w:rFonts w:ascii="Arial" w:hAnsi="Arial" w:cs="Arial"/>
-                <w:color w:val="000000" w:themeColor="text1" w:themeShade="80"/>
-                <w:w w:val="105"/>
-                <w:sz w:val="22"/>
-                <w:szCs w:val="22"/>
-              </w:rPr>
-              <w:t>in</w:t>
-            </w:r>
-            <w:r>
-              <w:rPr>
-                <w:rFonts w:ascii="Arial" w:hAnsi="Arial" w:cs="Arial"/>
-                <w:color w:val="000000" w:themeColor="text1" w:themeShade="80"/>
-                <w:spacing w:val="-6"/>
-                <w:w w:val="105"/>
-                <w:sz w:val="22"/>
-                <w:szCs w:val="22"/>
-              </w:rPr>
-              <w:t xml:space="preserve"> </w:t>
-            </w:r>
-            <w:r>
-              <w:rPr>
-                <w:rFonts w:ascii="Arial" w:hAnsi="Arial" w:cs="Arial"/>
-                <w:color w:val="000000" w:themeColor="text1" w:themeShade="80"/>
-                <w:w w:val="105"/>
-                <w:sz w:val="22"/>
-                <w:szCs w:val="22"/>
-              </w:rPr>
-              <w:t>a</w:t>
-            </w:r>
-            <w:r>
-              <w:rPr>
-                <w:rFonts w:ascii="Arial" w:hAnsi="Arial" w:cs="Arial"/>
-                <w:color w:val="000000" w:themeColor="text1" w:themeShade="80"/>
-                <w:spacing w:val="-39"/>
-                <w:w w:val="105"/>
-                <w:sz w:val="22"/>
-                <w:szCs w:val="22"/>
-              </w:rPr>
-              <w:t xml:space="preserve"> </w:t>
-            </w:r>
-            <w:r>
-              <w:rPr>
-                <w:rFonts w:ascii="Arial" w:hAnsi="Arial" w:cs="Arial"/>
-                <w:color w:val="000000" w:themeColor="text1" w:themeShade="80"/>
-                <w:w w:val="105"/>
-                <w:sz w:val="22"/>
-                <w:szCs w:val="22"/>
-              </w:rPr>
-              <w:t>certain industry or service area and the roles that you have</w:t>
-            </w:r>
-            <w:r>
-              <w:rPr>
-                <w:rFonts w:ascii="Arial" w:hAnsi="Arial" w:cs="Arial"/>
-                <w:color w:val="000000" w:themeColor="text1" w:themeShade="80"/>
-                <w:spacing w:val="-1"/>
-                <w:w w:val="105"/>
-                <w:sz w:val="22"/>
-                <w:szCs w:val="22"/>
-              </w:rPr>
-              <w:t xml:space="preserve"> </w:t>
-            </w:r>
-            <w:r>
-              <w:rPr>
-                <w:rFonts w:ascii="Arial" w:hAnsi="Arial" w:cs="Arial"/>
-                <w:color w:val="000000" w:themeColor="text1" w:themeShade="80"/>
-                <w:w w:val="105"/>
-                <w:sz w:val="22"/>
-                <w:szCs w:val="22"/>
-              </w:rPr>
-              <w:t>held&gt;</w:t>
-            </w:r>
-          </w:p>
-          <w:p>
-            <w:pPr>
-              <w:spacing w:before="120" w:after="120" w:line="240" w:lineRule="auto"/>
-              <w:rPr>
-                <w:rFonts w:ascii="Arial" w:hAnsi="Arial" w:cs="Arial"/>
                 <w:color w:val="000000" w:themeColor="text1" w:themeShade="80"/>
                 <w:spacing w:val="-2"/>
                 <w:w w:val="105"/>
@@ -495,107 +255,14 @@
               <w:rPr>
                 <w:rFonts w:ascii="Arial" w:hAnsi="Arial" w:cs="Arial"/>
                 <w:color w:val="000000" w:themeColor="text1" w:themeShade="80"/>
+                <w:spacing w:val="-2"/>
                 <w:w w:val="105"/>
                 <w:sz w:val="22"/>
                 <w:szCs w:val="22"/>
               </w:rPr>
-              <w:t>&lt;Summarize your</w:t>
+              <w:t>{{</w:t>
             </w:r>
-            <w:r>
-              <w:rPr>
-                <w:rFonts w:ascii="Arial" w:hAnsi="Arial" w:cs="Arial"/>
-                <w:color w:val="000000" w:themeColor="text1" w:themeShade="80"/>
-                <w:spacing w:val="-9"/>
-                <w:w w:val="105"/>
-                <w:sz w:val="22"/>
-                <w:szCs w:val="22"/>
-              </w:rPr>
-              <w:t xml:space="preserve"> </w:t>
-            </w:r>
-            <w:r>
-              <w:rPr>
-                <w:rFonts w:ascii="Arial" w:hAnsi="Arial" w:cs="Arial"/>
-                <w:color w:val="000000" w:themeColor="text1" w:themeShade="80"/>
-                <w:w w:val="105"/>
-                <w:sz w:val="22"/>
-                <w:szCs w:val="22"/>
-              </w:rPr>
-              <w:t>breadth</w:t>
-            </w:r>
-            <w:r>
-              <w:rPr>
-                <w:rFonts w:ascii="Arial" w:hAnsi="Arial" w:cs="Arial"/>
-                <w:color w:val="000000" w:themeColor="text1" w:themeShade="80"/>
-                <w:spacing w:val="-9"/>
-                <w:w w:val="105"/>
-                <w:sz w:val="22"/>
-                <w:szCs w:val="22"/>
-              </w:rPr>
-              <w:t xml:space="preserve"> </w:t>
-            </w:r>
-            <w:r>
-              <w:rPr>
-                <w:rFonts w:ascii="Arial" w:hAnsi="Arial" w:cs="Arial"/>
-                <w:color w:val="000000" w:themeColor="text1" w:themeShade="80"/>
-                <w:w w:val="105"/>
-                <w:sz w:val="22"/>
-                <w:szCs w:val="22"/>
-              </w:rPr>
-              <w:t>of</w:t>
-            </w:r>
-            <w:r>
-              <w:rPr>
-                <w:rFonts w:ascii="Arial" w:hAnsi="Arial" w:cs="Arial"/>
-                <w:color w:val="000000" w:themeColor="text1" w:themeShade="80"/>
-                <w:spacing w:val="-17"/>
-                <w:w w:val="105"/>
-                <w:sz w:val="22"/>
-                <w:szCs w:val="22"/>
-              </w:rPr>
-              <w:t xml:space="preserve"> </w:t>
-            </w:r>
-            <w:r>
-              <w:rPr>
-                <w:rFonts w:ascii="Arial" w:hAnsi="Arial" w:cs="Arial"/>
-                <w:color w:val="000000" w:themeColor="text1" w:themeShade="80"/>
-                <w:w w:val="105"/>
-                <w:sz w:val="22"/>
-                <w:szCs w:val="22"/>
-              </w:rPr>
-              <w:t>experience</w:t>
-            </w:r>
-            <w:r>
-              <w:rPr>
-                <w:rFonts w:ascii="Arial" w:hAnsi="Arial" w:cs="Arial"/>
-                <w:color w:val="000000" w:themeColor="text1" w:themeShade="80"/>
-                <w:spacing w:val="-9"/>
-                <w:w w:val="105"/>
-                <w:sz w:val="22"/>
-                <w:szCs w:val="22"/>
-              </w:rPr>
-              <w:t xml:space="preserve"> </w:t>
-            </w:r>
-            <w:r>
-              <w:rPr>
-                <w:rFonts w:ascii="Arial" w:hAnsi="Arial" w:cs="Arial"/>
-                <w:color w:val="000000" w:themeColor="text1" w:themeShade="80"/>
-                <w:w w:val="105"/>
-                <w:sz w:val="22"/>
-                <w:szCs w:val="22"/>
-              </w:rPr>
-              <w:t>and</w:t>
-            </w:r>
-            <w:r>
-              <w:rPr>
-                <w:rFonts w:ascii="Arial" w:hAnsi="Arial" w:cs="Arial"/>
-                <w:color w:val="000000" w:themeColor="text1" w:themeShade="80"/>
-                <w:spacing w:val="-17"/>
-                <w:w w:val="105"/>
-                <w:sz w:val="22"/>
-                <w:szCs w:val="22"/>
-              </w:rPr>
-              <w:t xml:space="preserve"> </w:t>
-            </w:r>
+            <w:proofErr w:type="spellStart"/>
             <w:r>
               <w:rPr>
                 <w:rFonts w:ascii="Arial" w:hAnsi="Arial" w:cs="Arial"/>
@@ -605,7 +272,19 @@
                 <w:sz w:val="22"/>
                 <w:szCs w:val="22"/>
               </w:rPr>
-              <w:t>expertise here&gt;</w:t>
+              <w:t>professionalSummary</w:t>
+            </w:r>
+            <w:proofErr w:type="spellEnd"/>
+            <w:r>
+              <w:rPr>
+                <w:rFonts w:ascii="Arial" w:hAnsi="Arial" w:cs="Arial"/>
+                <w:color w:val="000000" w:themeColor="text1" w:themeShade="80"/>
+                <w:spacing w:val="-2"/>
+                <w:w w:val="105"/>
+                <w:sz w:val="22"/>
+                <w:szCs w:val="22"/>
+              </w:rPr>
+              <w:t>}}</w:t>
             </w:r>
           </w:p>
           <w:p>
@@ -5029,7 +4708,6 @@
   <w:style w:type="character" w:default="1" w:styleId="DefaultParagraphFont">
     <w:name w:val="Default Paragraph Font"/>
     <w:uiPriority w:val="1"/>
-    <w:semiHidden/>
     <w:unhideWhenUsed/>
   </w:style>
   <w:style w:type="table" w:default="1" w:styleId="TableNormal">
@@ -5739,14 +5417,12 @@
 </file>
 
 <file path=customXml/item1.xml><?xml version="1.0" encoding="utf-8"?>
-<p:properties xmlns:p="http://schemas.microsoft.com/office/2006/metadata/properties" xmlns:xsi="http://www.w3.org/2001/XMLSchema-instance" xmlns:pc="http://schemas.microsoft.com/office/infopath/2007/PartnerControls">
-  <documentManagement>
-    <lcf76f155ced4ddcb4097134ff3c332f xmlns="825b4f20-597c-4909-bc0b-368dce048b6f">
-      <Terms xmlns="http://schemas.microsoft.com/office/infopath/2007/PartnerControls"/>
-    </lcf76f155ced4ddcb4097134ff3c332f>
-    <TaxCatchAll xmlns="88277476-d7b8-4914-a8c1-9da81a4263ec" xsi:nil="true"/>
-  </documentManagement>
-</p:properties>
+<?mso-contentType ?>
+<FormTemplates xmlns="http://schemas.microsoft.com/sharepoint/v3/contenttype/forms">
+  <Display>DocumentLibraryForm</Display>
+  <Edit>DocumentLibraryForm</Edit>
+  <New>DocumentLibraryForm</New>
+</FormTemplates>
 </file>
 
 <file path=customXml/item2.xml><?xml version="1.0" encoding="utf-8"?>
@@ -5977,21 +5653,20 @@
 </file>
 
 <file path=customXml/item3.xml><?xml version="1.0" encoding="utf-8"?>
-<?mso-contentType ?>
-<FormTemplates xmlns="http://schemas.microsoft.com/sharepoint/v3/contenttype/forms">
-  <Display>DocumentLibraryForm</Display>
-  <Edit>DocumentLibraryForm</Edit>
-  <New>DocumentLibraryForm</New>
-</FormTemplates>
+<p:properties xmlns:p="http://schemas.microsoft.com/office/2006/metadata/properties" xmlns:xsi="http://www.w3.org/2001/XMLSchema-instance" xmlns:pc="http://schemas.microsoft.com/office/infopath/2007/PartnerControls">
+  <documentManagement>
+    <lcf76f155ced4ddcb4097134ff3c332f xmlns="825b4f20-597c-4909-bc0b-368dce048b6f">
+      <Terms xmlns="http://schemas.microsoft.com/office/infopath/2007/PartnerControls"/>
+    </lcf76f155ced4ddcb4097134ff3c332f>
+    <TaxCatchAll xmlns="88277476-d7b8-4914-a8c1-9da81a4263ec" xsi:nil="true"/>
+  </documentManagement>
+</p:properties>
 </file>
 
 <file path=customXml/itemProps1.xml><?xml version="1.0" encoding="utf-8"?>
-<ds:datastoreItem xmlns:ds="http://schemas.openxmlformats.org/officeDocument/2006/customXml" ds:itemID="{94ACB0AA-19CB-4A86-8E58-EBBD44A97BCC}">
+<ds:datastoreItem xmlns:ds="http://schemas.openxmlformats.org/officeDocument/2006/customXml" ds:itemID="{1BA90A2F-8B0E-4DA6-B84C-5650BE5F9A62}">
   <ds:schemaRefs>
-    <ds:schemaRef ds:uri="http://schemas.microsoft.com/office/2006/metadata/properties"/>
-    <ds:schemaRef ds:uri="http://schemas.microsoft.com/office/infopath/2007/PartnerControls"/>
-    <ds:schemaRef ds:uri="825b4f20-597c-4909-bc0b-368dce048b6f"/>
-    <ds:schemaRef ds:uri="88277476-d7b8-4914-a8c1-9da81a4263ec"/>
+    <ds:schemaRef ds:uri="http://schemas.microsoft.com/sharepoint/v3/contenttype/forms"/>
   </ds:schemaRefs>
 </ds:datastoreItem>
 </file>
@@ -6016,9 +5691,12 @@
 </file>
 
 <file path=customXml/itemProps3.xml><?xml version="1.0" encoding="utf-8"?>
-<ds:datastoreItem xmlns:ds="http://schemas.openxmlformats.org/officeDocument/2006/customXml" ds:itemID="{1BA90A2F-8B0E-4DA6-B84C-5650BE5F9A62}">
+<ds:datastoreItem xmlns:ds="http://schemas.openxmlformats.org/officeDocument/2006/customXml" ds:itemID="{94ACB0AA-19CB-4A86-8E58-EBBD44A97BCC}">
   <ds:schemaRefs>
-    <ds:schemaRef ds:uri="http://schemas.microsoft.com/sharepoint/v3/contenttype/forms"/>
+    <ds:schemaRef ds:uri="http://schemas.microsoft.com/office/2006/metadata/properties"/>
+    <ds:schemaRef ds:uri="http://schemas.microsoft.com/office/infopath/2007/PartnerControls"/>
+    <ds:schemaRef ds:uri="825b4f20-597c-4909-bc0b-368dce048b6f"/>
+    <ds:schemaRef ds:uri="88277476-d7b8-4914-a8c1-9da81a4263ec"/>
   </ds:schemaRefs>
 </ds:datastoreItem>
 </file>
</xml_diff>